<commit_message>
Corte de chapa: tipo de cambio fijo 1420, 20 golpes por minuto confirmados y sin pendientes de planos
Co-Authored-By: Claude Opus 5.5 <noreply@anthropic.com>
Claude-Session: https://claude.ai/code/session_01E33CYXtZ2f33D1RjoRdR65
</commit_message>
<xml_diff>
--- a/salida/Esquema_de_corte_cuerpo_1_kg_chapa_09_mm.docx
+++ b/salida/Esquema_de_corte_cuerpo_1_kg_chapa_09_mm.docx
@@ -1400,7 +1400,7 @@
           <w:sz w:val="16"/>
           <w:szCs w:val="16"/>
         </w:rPr>
-        <w:t xml:space="preserve">Tiempos a ritmo de máquina (golpes por minuto), sin manipulación. 20 golpes por minuto de la G2: ficha Molinari HG 6 × 2500, a confirmar con el vendedor del link.</w:t>
+        <w:t xml:space="preserve">Tiempos a ritmo de máquina (golpes por minuto), sin manipulación: 10 golpes por minuto la G1 y 20 la G2.</w:t>
       </w:r>
     </w:p>
     <w:p>
@@ -2746,25 +2746,6 @@
           <w:szCs w:val="19"/>
         </w:rPr>
         <w:t xml:space="preserve">Las orillas de 37,5 mm y los recortes de 68,5 mm no sirven para discos: la cúpula del 1 kg necesita un fleje de 93 mm de ancho.</w:t>
-      </w:r>
-    </w:p>
-    <w:p>
-      <w:pPr>
-        <w:pStyle w:val="ListParagraph"/>
-        <w:numPr>
-          <w:ilvl w:val="0"/>
-          <w:numId w:val="2"/>
-        </w:numPr>
-        <w:spacing w:after="40" w:before="0" w:line="276"/>
-      </w:pPr>
-      <w:r>
-        <w:rPr>
-          <w:rFonts w:ascii="Arial" w:cs="Arial" w:eastAsia="Arial" w:hAnsi="Arial"/>
-          <w:color w:val="000000"/>
-          <w:sz w:val="19"/>
-          <w:szCs w:val="19"/>
-        </w:rPr>
-        <w:t xml:space="preserve">Falta cambiar el plano G809: cuerpo de 0,9 mm en chapa con costura longitudinal.</w:t>
       </w:r>
     </w:p>
     <w:sectPr>

</xml_diff>